<commit_message>
docs: §11.4.44 revision-header compliance — bump CLAUDE/AGENTS/QWEN to Revision 2 (Last modified 2026-06-02T09:49:46Z) after the CLAUDE-3/AGENT-2/QWEN-2 edits; regenerate md->html/pdf/docx exports (docs_chain verify in-sync).
Self-caught in the compliance review: §11.4.44 mandates a monotonic revision header + ISO Last-modified on every in-scope tracked doc; the prior commit changed these docs without bumping the header.

Co-Authored-By: Claude Opus 4.8 <noreply@anthropic.com>
</commit_message>
<xml_diff>
--- a/docs/export/AGENTS.docx
+++ b/docs/export/AGENTS.docx
@@ -75,7 +75,7 @@
               <w:pStyle w:val="Compact"/>
             </w:pPr>
             <w:r>
-              <w:t xml:space="preserve">1</w:t>
+              <w:t xml:space="preserve">2</w:t>
             </w:r>
           </w:p>
         </w:tc>
@@ -123,7 +123,7 @@
               <w:pStyle w:val="Compact"/>
             </w:pPr>
             <w:r>
-              <w:t xml:space="preserve">2026-05-30T20:43:00Z</w:t>
+              <w:t xml:space="preserve">2026-06-02T09:49:46Z</w:t>
             </w:r>
           </w:p>
         </w:tc>

</xml_diff>